<commit_message>
archivo 1.5 terminado y base de PPT terminado
</commit_message>
<xml_diff>
--- a/Aldo Alberto Martinez Ordenes/PTY4614_Capstone_004D/Equipo/Fase 1/Evidencias Grupales/1.5_GuiaEstudiante_Fase 1_Definicion Proyecto APT.docx
+++ b/Aldo Alberto Martinez Ordenes/PTY4614_Capstone_004D/Equipo/Fase 1/Evidencias Grupales/1.5_GuiaEstudiante_Fase 1_Definicion Proyecto APT.docx
@@ -1324,7 +1324,23 @@
                 <w:sz w:val="20"/>
                 <w:szCs w:val="20"/>
               </w:rPr>
-              <w:t>La creación y desarrollo de documentación es uno de los intereses presentes, mayormente en esta primera fase del proyecto. También el desarrollo de software es otro de los intereses abordados en este proyecto, debido a la naturaleza del mismo.</w:t>
+              <w:t xml:space="preserve">La creación y desarrollo de documentación es uno de los intereses presentes, mayormente en esta primera fase del proyecto. También el desarrollo de software es otro de los intereses abordados en este proyecto, debido a la naturaleza </w:t>
+            </w:r>
+            <w:proofErr w:type="gramStart"/>
+            <w:r>
+              <w:rPr>
+                <w:sz w:val="20"/>
+                <w:szCs w:val="20"/>
+              </w:rPr>
+              <w:t>del mismo</w:t>
+            </w:r>
+            <w:proofErr w:type="gramEnd"/>
+            <w:r>
+              <w:rPr>
+                <w:sz w:val="20"/>
+                <w:szCs w:val="20"/>
+              </w:rPr>
+              <w:t>.</w:t>
             </w:r>
           </w:p>
           <w:p>
@@ -1398,7 +1414,23 @@
                 <w:sz w:val="20"/>
                 <w:szCs w:val="20"/>
               </w:rPr>
-              <w:t>El proyecto cuenta con restricciones importantes a considerar para su factibilidad, como un presupuesto limitado y una infraestructura limitada debido a la naturaleza del proyecto. Además, existen limitaciones por la falta o velocidad de obtención de conocimientos y por los marcos evaluativos. A pesar de esto, se ha establecido como premisa que el proyecto debe terminarse antes del 30-11-2026, y se cuenta con un equipo de trabajo con roles definidos para lograrlo.</w:t>
+              <w:t xml:space="preserve">El proyecto cuenta con restricciones importantes a considerar para su factibilidad, como un </w:t>
+            </w:r>
+            <w:proofErr w:type="gramStart"/>
+            <w:r>
+              <w:rPr>
+                <w:sz w:val="20"/>
+                <w:szCs w:val="20"/>
+              </w:rPr>
+              <w:t>presupuesto limitado y una infraestructura limitada</w:t>
+            </w:r>
+            <w:proofErr w:type="gramEnd"/>
+            <w:r>
+              <w:rPr>
+                <w:sz w:val="20"/>
+                <w:szCs w:val="20"/>
+              </w:rPr>
+              <w:t xml:space="preserve"> debido a la naturaleza del proyecto. Además, existen limitaciones por la falta o velocidad de obtención de conocimientos y por los marcos evaluativos. A pesar de esto, se ha establecido como premisa que el proyecto debe terminarse antes del 30-11-2026, y se cuenta con un equipo de trabajo con roles definidos para lograrlo.</w:t>
             </w:r>
           </w:p>
         </w:tc>
@@ -3350,7 +3382,21 @@
               <w:rPr>
                 <w:color w:val="1F3864"/>
               </w:rPr>
-              <w:t>En la siguiente tabla define la planificación de tu Proyecto APT de acuerdo a lo requerido.</w:t>
+              <w:t xml:space="preserve">En la siguiente tabla define la planificación de tu Proyecto APT </w:t>
+            </w:r>
+            <w:proofErr w:type="gramStart"/>
+            <w:r>
+              <w:rPr>
+                <w:color w:val="1F3864"/>
+              </w:rPr>
+              <w:t>de acuerdo a</w:t>
+            </w:r>
+            <w:proofErr w:type="gramEnd"/>
+            <w:r>
+              <w:rPr>
+                <w:color w:val="1F3864"/>
+              </w:rPr>
+              <w:t xml:space="preserve"> lo requerido.</w:t>
             </w:r>
           </w:p>
         </w:tc>
@@ -3389,8 +3435,8 @@
         <w:gridCol w:w="1580"/>
         <w:gridCol w:w="1580"/>
         <w:gridCol w:w="1580"/>
-        <w:gridCol w:w="1580"/>
-        <w:gridCol w:w="1580"/>
+        <w:gridCol w:w="2059"/>
+        <w:gridCol w:w="1101"/>
         <w:gridCol w:w="1580"/>
         <w:gridCol w:w="1581"/>
       </w:tblGrid>
@@ -3464,7 +3510,21 @@
               <w:rPr>
                 <w:color w:val="1F3864"/>
               </w:rPr>
-              <w:t>Nombre de  Actividades/Tareas</w:t>
+              <w:t xml:space="preserve">Nombre </w:t>
+            </w:r>
+            <w:proofErr w:type="gramStart"/>
+            <w:r>
+              <w:rPr>
+                <w:color w:val="1F3864"/>
+              </w:rPr>
+              <w:t>de  Actividades</w:t>
+            </w:r>
+            <w:proofErr w:type="gramEnd"/>
+            <w:r>
+              <w:rPr>
+                <w:color w:val="1F3864"/>
+              </w:rPr>
+              <w:t>/Tareas</w:t>
             </w:r>
           </w:p>
         </w:tc>
@@ -3490,7 +3550,7 @@
         </w:tc>
         <w:tc>
           <w:tcPr>
-            <w:tcW w:w="1580" w:type="dxa"/>
+            <w:tcW w:w="2059" w:type="dxa"/>
             <w:vAlign w:val="center"/>
           </w:tcPr>
           <w:p>
@@ -3510,7 +3570,7 @@
         </w:tc>
         <w:tc>
           <w:tcPr>
-            <w:tcW w:w="1580" w:type="dxa"/>
+            <w:tcW w:w="1101" w:type="dxa"/>
             <w:tcBorders>
               <w:right w:val="single" w:sz="4" w:space="0" w:color="FFFFFF"/>
             </w:tcBorders>
@@ -3559,6 +3619,7 @@
               <w:rPr>
                 <w:color w:val="1F3864"/>
               </w:rPr>
+              <w:lastRenderedPageBreak/>
               <w:t>Responsable</w:t>
             </w:r>
             <w:r>
@@ -3601,147 +3662,106 @@
           </w:tcPr>
           <w:p>
             <w:pPr>
+              <w:jc w:val="center"/>
+              <w:rPr>
+                <w:sz w:val="18"/>
+                <w:szCs w:val="18"/>
+              </w:rPr>
+            </w:pPr>
+            <w:r>
+              <w:rPr>
+                <w:sz w:val="18"/>
+                <w:szCs w:val="18"/>
+              </w:rPr>
+              <w:t>Gestión de Proyectos y Metodologías Híbridas/Cascada.</w:t>
+            </w:r>
+          </w:p>
+        </w:tc>
+        <w:tc>
+          <w:tcPr>
+            <w:tcW w:w="1580" w:type="dxa"/>
+          </w:tcPr>
+          <w:p>
+            <w:pPr>
+              <w:jc w:val="center"/>
+              <w:rPr>
+                <w:sz w:val="18"/>
+                <w:szCs w:val="18"/>
+              </w:rPr>
+            </w:pPr>
+            <w:r>
+              <w:rPr>
+                <w:sz w:val="18"/>
+                <w:szCs w:val="18"/>
+              </w:rPr>
+              <w:t>Planificación y Organización Inicial</w:t>
+            </w:r>
+          </w:p>
+        </w:tc>
+        <w:tc>
+          <w:tcPr>
+            <w:tcW w:w="1580" w:type="dxa"/>
+          </w:tcPr>
+          <w:p>
+            <w:pPr>
               <w:jc w:val="both"/>
               <w:rPr>
-                <w:i/>
-                <w:iCs/>
-                <w:color w:val="548DD4"/>
-                <w:sz w:val="18"/>
-                <w:szCs w:val="18"/>
-              </w:rPr>
-            </w:pPr>
-            <w:r>
-              <w:rPr>
-                <w:i/>
-                <w:iCs/>
-                <w:color w:val="548DD4"/>
-                <w:sz w:val="18"/>
-                <w:szCs w:val="18"/>
-              </w:rPr>
-              <w:lastRenderedPageBreak/>
-              <w:t>Nombra las competencias o unidades de competencias que se relacionan con las diferentes actividades requeridas para el desarrollo de la actividad.</w:t>
-            </w:r>
-          </w:p>
-        </w:tc>
-        <w:tc>
-          <w:tcPr>
-            <w:tcW w:w="1580" w:type="dxa"/>
+                <w:sz w:val="18"/>
+                <w:szCs w:val="18"/>
+              </w:rPr>
+            </w:pPr>
+            <w:r>
+              <w:rPr>
+                <w:sz w:val="18"/>
+                <w:szCs w:val="18"/>
+              </w:rPr>
+              <w:t>Realizar documentación inicial, establecer roles del equipo, asignar tareas, establecer cronograma e identificar riesgos del proyecto.</w:t>
+            </w:r>
+          </w:p>
+        </w:tc>
+        <w:tc>
+          <w:tcPr>
+            <w:tcW w:w="2059" w:type="dxa"/>
           </w:tcPr>
           <w:p>
             <w:pPr>
               <w:jc w:val="both"/>
               <w:rPr>
-                <w:b/>
-                <w:bCs/>
-                <w:sz w:val="18"/>
-                <w:szCs w:val="18"/>
-              </w:rPr>
-            </w:pPr>
-            <w:r>
-              <w:rPr>
-                <w:i/>
-                <w:iCs/>
-                <w:color w:val="548DD4"/>
-                <w:sz w:val="18"/>
-                <w:szCs w:val="18"/>
-              </w:rPr>
-              <w:t>Señale el nombre de la tarea o actividad.</w:t>
-            </w:r>
-          </w:p>
-        </w:tc>
-        <w:tc>
-          <w:tcPr>
-            <w:tcW w:w="1580" w:type="dxa"/>
-          </w:tcPr>
-          <w:p>
-            <w:pPr>
-              <w:jc w:val="both"/>
-              <w:rPr>
-                <w:b/>
-                <w:bCs/>
-                <w:sz w:val="18"/>
-                <w:szCs w:val="18"/>
-              </w:rPr>
-            </w:pPr>
-            <w:r>
-              <w:rPr>
-                <w:i/>
-                <w:iCs/>
-                <w:color w:val="548DD4"/>
-                <w:sz w:val="18"/>
-                <w:szCs w:val="18"/>
-              </w:rPr>
-              <w:t>Describe la tarea o actividad.</w:t>
-            </w:r>
-          </w:p>
-        </w:tc>
-        <w:tc>
-          <w:tcPr>
-            <w:tcW w:w="1580" w:type="dxa"/>
-          </w:tcPr>
-          <w:p>
-            <w:pPr>
-              <w:jc w:val="both"/>
-              <w:rPr>
-                <w:i/>
-                <w:iCs/>
-                <w:color w:val="548DD4"/>
-                <w:sz w:val="18"/>
-                <w:szCs w:val="18"/>
-              </w:rPr>
-            </w:pPr>
-            <w:r>
-              <w:rPr>
-                <w:i/>
-                <w:iCs/>
-                <w:color w:val="548DD4"/>
-                <w:sz w:val="18"/>
-                <w:szCs w:val="18"/>
-              </w:rPr>
-              <w:t>Nombra los recursos necesarios para llevar a cabo las actividades definidas.</w:t>
-            </w:r>
-          </w:p>
-        </w:tc>
-        <w:tc>
-          <w:tcPr>
-            <w:tcW w:w="1580" w:type="dxa"/>
+                <w:sz w:val="18"/>
+                <w:szCs w:val="18"/>
+              </w:rPr>
+            </w:pPr>
+            <w:r>
+              <w:rPr>
+                <w:sz w:val="18"/>
+                <w:szCs w:val="18"/>
+              </w:rPr>
+              <w:t>Acta de Constitución, herramientas de ofimática y gestión de proyectos.</w:t>
+            </w:r>
+          </w:p>
+        </w:tc>
+        <w:tc>
+          <w:tcPr>
+            <w:tcW w:w="1101" w:type="dxa"/>
             <w:tcBorders>
               <w:right w:val="single" w:sz="4" w:space="0" w:color="FFFFFF"/>
             </w:tcBorders>
           </w:tcPr>
           <w:p>
             <w:pPr>
-              <w:jc w:val="both"/>
-              <w:rPr>
-                <w:i/>
-                <w:iCs/>
-                <w:color w:val="548DD4"/>
-                <w:sz w:val="18"/>
-                <w:szCs w:val="18"/>
-              </w:rPr>
-            </w:pPr>
-            <w:r>
-              <w:rPr>
-                <w:i/>
-                <w:iCs/>
-                <w:color w:val="548DD4"/>
-                <w:sz w:val="18"/>
-                <w:szCs w:val="18"/>
-              </w:rPr>
-              <w:t>Escribe la duración de actividades o tarea.</w:t>
-            </w:r>
-          </w:p>
-          <w:p>
-            <w:pPr>
-              <w:jc w:val="both"/>
-              <w:rPr>
-                <w:i/>
-                <w:iCs/>
-                <w:color w:val="548DD4"/>
-                <w:sz w:val="18"/>
-                <w:szCs w:val="18"/>
-              </w:rPr>
-            </w:pPr>
+              <w:jc w:val="center"/>
+              <w:rPr>
+                <w:sz w:val="18"/>
+                <w:szCs w:val="18"/>
+              </w:rPr>
+            </w:pPr>
+            <w:r>
+              <w:rPr>
+                <w:sz w:val="18"/>
+                <w:szCs w:val="18"/>
+              </w:rPr>
+              <w:t>Semanas 1 a 3</w:t>
+            </w:r>
           </w:p>
         </w:tc>
         <w:tc>
@@ -3754,49 +3774,55 @@
           </w:tcPr>
           <w:p>
             <w:pPr>
+              <w:jc w:val="center"/>
+              <w:rPr>
+                <w:sz w:val="18"/>
+                <w:szCs w:val="18"/>
+              </w:rPr>
+            </w:pPr>
+            <w:r>
+              <w:rPr>
+                <w:sz w:val="18"/>
+                <w:szCs w:val="18"/>
+              </w:rPr>
+              <w:t>Benjamín Díaz (Gerente de Proyecto).</w:t>
+            </w:r>
+          </w:p>
+        </w:tc>
+        <w:tc>
+          <w:tcPr>
+            <w:tcW w:w="1581" w:type="dxa"/>
+          </w:tcPr>
+          <w:p>
+            <w:pPr>
               <w:jc w:val="both"/>
               <w:rPr>
-                <w:b/>
-                <w:bCs/>
-                <w:sz w:val="18"/>
-                <w:szCs w:val="18"/>
-              </w:rPr>
-            </w:pPr>
-            <w:r>
-              <w:rPr>
-                <w:i/>
-                <w:iCs/>
-                <w:color w:val="548DD4"/>
-                <w:sz w:val="18"/>
-                <w:szCs w:val="18"/>
-              </w:rPr>
-              <w:t>Escribe el nombre del integrante del equipo responsable de la actividad y tareas asociadas.</w:t>
-            </w:r>
-          </w:p>
-        </w:tc>
-        <w:tc>
-          <w:tcPr>
-            <w:tcW w:w="1581" w:type="dxa"/>
-          </w:tcPr>
+                <w:sz w:val="18"/>
+                <w:szCs w:val="18"/>
+              </w:rPr>
+            </w:pPr>
+            <w:r>
+              <w:rPr>
+                <w:sz w:val="18"/>
+                <w:szCs w:val="18"/>
+              </w:rPr>
+              <w:t>Facilitador: Los roles principales ya están bien definidos.</w:t>
+            </w:r>
+          </w:p>
           <w:p>
             <w:pPr>
               <w:jc w:val="both"/>
               <w:rPr>
-                <w:b/>
-                <w:bCs/>
-                <w:sz w:val="18"/>
-                <w:szCs w:val="18"/>
-              </w:rPr>
-            </w:pPr>
-            <w:r>
-              <w:rPr>
-                <w:i/>
-                <w:iCs/>
-                <w:color w:val="548DD4"/>
-                <w:sz w:val="18"/>
-                <w:szCs w:val="18"/>
-              </w:rPr>
-              <w:t>Escribe las dificultades o facilitadores que se podrían presentar durante la ejecución de cada una de las actividades propuestas para llevar a cabo el plan de trabajo.</w:t>
+                <w:sz w:val="18"/>
+                <w:szCs w:val="18"/>
+              </w:rPr>
+            </w:pPr>
+            <w:r>
+              <w:rPr>
+                <w:sz w:val="18"/>
+                <w:szCs w:val="18"/>
+              </w:rPr>
+              <w:t>Dificultad: Coordinar los tiempos iniciales y cumplir con los marcos evaluativos limitantes.</w:t>
             </w:r>
           </w:p>
         </w:tc>
@@ -3811,86 +3837,122 @@
           </w:tcPr>
           <w:p>
             <w:pPr>
+              <w:jc w:val="center"/>
+              <w:rPr>
+                <w:sz w:val="18"/>
+                <w:szCs w:val="18"/>
+              </w:rPr>
+            </w:pPr>
+            <w:r>
+              <w:rPr>
+                <w:sz w:val="18"/>
+                <w:szCs w:val="18"/>
+              </w:rPr>
+              <w:t>Diseño de Arquitectura de Software e Interfaces (UI/UX).</w:t>
+            </w:r>
+          </w:p>
+        </w:tc>
+        <w:tc>
+          <w:tcPr>
+            <w:tcW w:w="1580" w:type="dxa"/>
+          </w:tcPr>
+          <w:p>
+            <w:pPr>
+              <w:jc w:val="center"/>
+              <w:rPr>
+                <w:sz w:val="18"/>
+                <w:szCs w:val="18"/>
+              </w:rPr>
+            </w:pPr>
+            <w:r>
+              <w:rPr>
+                <w:sz w:val="18"/>
+                <w:szCs w:val="18"/>
+              </w:rPr>
+              <w:t>Definición Técnica, Diseño y Presentación</w:t>
+            </w:r>
+          </w:p>
+        </w:tc>
+        <w:tc>
+          <w:tcPr>
+            <w:tcW w:w="1580" w:type="dxa"/>
+          </w:tcPr>
+          <w:p>
+            <w:pPr>
               <w:jc w:val="both"/>
               <w:rPr>
-                <w:i/>
-                <w:iCs/>
-                <w:color w:val="548DD4"/>
-                <w:sz w:val="18"/>
-                <w:szCs w:val="18"/>
-              </w:rPr>
-            </w:pPr>
-          </w:p>
-        </w:tc>
-        <w:tc>
-          <w:tcPr>
-            <w:tcW w:w="1580" w:type="dxa"/>
+                <w:sz w:val="18"/>
+                <w:szCs w:val="18"/>
+              </w:rPr>
+            </w:pPr>
+            <w:r>
+              <w:rPr>
+                <w:sz w:val="18"/>
+                <w:szCs w:val="18"/>
+              </w:rPr>
+              <w:t>Establecer tecnologías y herramientas, diseñar arquitectura del sistema, desarrollar mockups de interfaz y presentar el proyecto.</w:t>
+            </w:r>
+          </w:p>
+        </w:tc>
+        <w:tc>
+          <w:tcPr>
+            <w:tcW w:w="2059" w:type="dxa"/>
           </w:tcPr>
           <w:p>
             <w:pPr>
               <w:jc w:val="both"/>
               <w:rPr>
-                <w:i/>
-                <w:iCs/>
-                <w:color w:val="548DD4"/>
-                <w:sz w:val="18"/>
-                <w:szCs w:val="18"/>
-              </w:rPr>
-            </w:pPr>
-          </w:p>
-        </w:tc>
-        <w:tc>
-          <w:tcPr>
-            <w:tcW w:w="1580" w:type="dxa"/>
-          </w:tcPr>
-          <w:p>
-            <w:pPr>
-              <w:jc w:val="both"/>
-              <w:rPr>
-                <w:i/>
-                <w:iCs/>
-                <w:color w:val="548DD4"/>
-                <w:sz w:val="18"/>
-                <w:szCs w:val="18"/>
-              </w:rPr>
-            </w:pPr>
-          </w:p>
-        </w:tc>
-        <w:tc>
-          <w:tcPr>
-            <w:tcW w:w="1580" w:type="dxa"/>
-          </w:tcPr>
-          <w:p>
-            <w:pPr>
-              <w:jc w:val="both"/>
-              <w:rPr>
-                <w:i/>
-                <w:iCs/>
-                <w:color w:val="548DD4"/>
-                <w:sz w:val="18"/>
-                <w:szCs w:val="18"/>
-              </w:rPr>
-            </w:pPr>
-          </w:p>
-        </w:tc>
-        <w:tc>
-          <w:tcPr>
-            <w:tcW w:w="1580" w:type="dxa"/>
+                <w:sz w:val="18"/>
+                <w:szCs w:val="18"/>
+              </w:rPr>
+            </w:pPr>
+            <w:r>
+              <w:rPr>
+                <w:sz w:val="18"/>
+                <w:szCs w:val="18"/>
+              </w:rPr>
+              <w:t xml:space="preserve">Herramientas de diseño (ej. </w:t>
+            </w:r>
+            <w:proofErr w:type="spellStart"/>
+            <w:r>
+              <w:rPr>
+                <w:sz w:val="18"/>
+                <w:szCs w:val="18"/>
+              </w:rPr>
+              <w:t>Figma</w:t>
+            </w:r>
+            <w:proofErr w:type="spellEnd"/>
+            <w:r>
+              <w:rPr>
+                <w:sz w:val="18"/>
+                <w:szCs w:val="18"/>
+              </w:rPr>
+              <w:t>), computadores, documentación técnica.</w:t>
+            </w:r>
+          </w:p>
+        </w:tc>
+        <w:tc>
+          <w:tcPr>
+            <w:tcW w:w="1101" w:type="dxa"/>
             <w:tcBorders>
               <w:right w:val="single" w:sz="4" w:space="0" w:color="FFFFFF"/>
             </w:tcBorders>
           </w:tcPr>
           <w:p>
             <w:pPr>
-              <w:jc w:val="both"/>
-              <w:rPr>
-                <w:i/>
-                <w:iCs/>
-                <w:color w:val="548DD4"/>
-                <w:sz w:val="18"/>
-                <w:szCs w:val="18"/>
-              </w:rPr>
-            </w:pPr>
+              <w:jc w:val="center"/>
+              <w:rPr>
+                <w:sz w:val="18"/>
+                <w:szCs w:val="18"/>
+              </w:rPr>
+            </w:pPr>
+            <w:r>
+              <w:rPr>
+                <w:sz w:val="18"/>
+                <w:szCs w:val="18"/>
+              </w:rPr>
+              <w:t>Semanas 1 a 4</w:t>
+            </w:r>
           </w:p>
         </w:tc>
         <w:tc>
@@ -3903,32 +3965,49 @@
           </w:tcPr>
           <w:p>
             <w:pPr>
+              <w:jc w:val="center"/>
+              <w:rPr>
+                <w:sz w:val="18"/>
+                <w:szCs w:val="18"/>
+              </w:rPr>
+            </w:pPr>
+            <w:r>
+              <w:rPr>
+                <w:sz w:val="18"/>
+                <w:szCs w:val="18"/>
+              </w:rPr>
+              <w:t>Iñaki Fernández (Desarrollador principal).</w:t>
+            </w:r>
+          </w:p>
+        </w:tc>
+        <w:tc>
+          <w:tcPr>
+            <w:tcW w:w="1581" w:type="dxa"/>
+          </w:tcPr>
+          <w:p>
+            <w:pPr>
               <w:jc w:val="both"/>
               <w:rPr>
-                <w:i/>
-                <w:iCs/>
-                <w:color w:val="548DD4"/>
-                <w:sz w:val="18"/>
-                <w:szCs w:val="18"/>
-              </w:rPr>
-            </w:pPr>
-          </w:p>
-        </w:tc>
-        <w:tc>
-          <w:tcPr>
-            <w:tcW w:w="1581" w:type="dxa"/>
-          </w:tcPr>
-          <w:p>
-            <w:pPr>
-              <w:jc w:val="both"/>
-              <w:rPr>
-                <w:i/>
-                <w:iCs/>
-                <w:color w:val="548DD4"/>
-                <w:sz w:val="18"/>
-                <w:szCs w:val="18"/>
-              </w:rPr>
-            </w:pPr>
+                <w:sz w:val="18"/>
+                <w:szCs w:val="18"/>
+              </w:rPr>
+            </w:pPr>
+            <w:r>
+              <w:rPr>
+                <w:b/>
+                <w:bCs/>
+                <w:sz w:val="18"/>
+                <w:szCs w:val="18"/>
+              </w:rPr>
+              <w:t>Dificultad:</w:t>
+            </w:r>
+            <w:r>
+              <w:rPr>
+                <w:sz w:val="18"/>
+                <w:szCs w:val="18"/>
+              </w:rPr>
+              <w:t xml:space="preserve"> Limitados por la falta o velocidad de obtención de conocimientos técnicos específicos en las etapas tempranas.</w:t>
+            </w:r>
           </w:p>
         </w:tc>
       </w:tr>
@@ -3942,86 +4021,122 @@
           </w:tcPr>
           <w:p>
             <w:pPr>
+              <w:jc w:val="center"/>
+              <w:rPr>
+                <w:sz w:val="18"/>
+                <w:szCs w:val="18"/>
+              </w:rPr>
+            </w:pPr>
+            <w:r>
+              <w:rPr>
+                <w:sz w:val="18"/>
+                <w:szCs w:val="18"/>
+              </w:rPr>
+              <w:t>Gestión y Modelado de Bases de Datos, y Procesamiento de Datos.</w:t>
+            </w:r>
+          </w:p>
+        </w:tc>
+        <w:tc>
+          <w:tcPr>
+            <w:tcW w:w="1580" w:type="dxa"/>
+          </w:tcPr>
+          <w:p>
+            <w:pPr>
+              <w:jc w:val="center"/>
+              <w:rPr>
+                <w:sz w:val="18"/>
+                <w:szCs w:val="18"/>
+              </w:rPr>
+            </w:pPr>
+            <w:r>
+              <w:rPr>
+                <w:sz w:val="18"/>
+                <w:szCs w:val="18"/>
+              </w:rPr>
+              <w:t>Manejo y Extracción de Datos</w:t>
+            </w:r>
+          </w:p>
+        </w:tc>
+        <w:tc>
+          <w:tcPr>
+            <w:tcW w:w="1580" w:type="dxa"/>
+          </w:tcPr>
+          <w:p>
+            <w:pPr>
               <w:jc w:val="both"/>
               <w:rPr>
-                <w:i/>
-                <w:iCs/>
-                <w:color w:val="548DD4"/>
-                <w:sz w:val="18"/>
-                <w:szCs w:val="18"/>
-              </w:rPr>
-            </w:pPr>
-          </w:p>
-        </w:tc>
-        <w:tc>
-          <w:tcPr>
-            <w:tcW w:w="1580" w:type="dxa"/>
+                <w:sz w:val="18"/>
+                <w:szCs w:val="18"/>
+              </w:rPr>
+            </w:pPr>
+            <w:r>
+              <w:rPr>
+                <w:sz w:val="18"/>
+                <w:szCs w:val="18"/>
+              </w:rPr>
+              <w:t xml:space="preserve">Desarrollo de </w:t>
+            </w:r>
+            <w:proofErr w:type="spellStart"/>
+            <w:r>
+              <w:rPr>
+                <w:sz w:val="18"/>
+                <w:szCs w:val="18"/>
+              </w:rPr>
+              <w:t>scrapers</w:t>
+            </w:r>
+            <w:proofErr w:type="spellEnd"/>
+            <w:r>
+              <w:rPr>
+                <w:sz w:val="18"/>
+                <w:szCs w:val="18"/>
+              </w:rPr>
+              <w:t xml:space="preserve"> para extraer eventos, modelado de la base de datos y posterior procesamiento de los datos recopilados.</w:t>
+            </w:r>
+          </w:p>
+        </w:tc>
+        <w:tc>
+          <w:tcPr>
+            <w:tcW w:w="2059" w:type="dxa"/>
           </w:tcPr>
           <w:p>
             <w:pPr>
               <w:jc w:val="both"/>
               <w:rPr>
-                <w:i/>
-                <w:iCs/>
-                <w:color w:val="548DD4"/>
-                <w:sz w:val="18"/>
-                <w:szCs w:val="18"/>
-              </w:rPr>
-            </w:pPr>
-          </w:p>
-        </w:tc>
-        <w:tc>
-          <w:tcPr>
-            <w:tcW w:w="1580" w:type="dxa"/>
-          </w:tcPr>
-          <w:p>
-            <w:pPr>
-              <w:jc w:val="both"/>
-              <w:rPr>
-                <w:i/>
-                <w:iCs/>
-                <w:color w:val="548DD4"/>
-                <w:sz w:val="18"/>
-                <w:szCs w:val="18"/>
-              </w:rPr>
-            </w:pPr>
-          </w:p>
-        </w:tc>
-        <w:tc>
-          <w:tcPr>
-            <w:tcW w:w="1580" w:type="dxa"/>
-          </w:tcPr>
-          <w:p>
-            <w:pPr>
-              <w:jc w:val="both"/>
-              <w:rPr>
-                <w:i/>
-                <w:iCs/>
-                <w:color w:val="548DD4"/>
-                <w:sz w:val="18"/>
-                <w:szCs w:val="18"/>
-              </w:rPr>
-            </w:pPr>
-          </w:p>
-        </w:tc>
-        <w:tc>
-          <w:tcPr>
-            <w:tcW w:w="1580" w:type="dxa"/>
+                <w:sz w:val="18"/>
+                <w:szCs w:val="18"/>
+              </w:rPr>
+            </w:pPr>
+            <w:r>
+              <w:rPr>
+                <w:sz w:val="18"/>
+                <w:szCs w:val="18"/>
+              </w:rPr>
+              <w:t>Lenguajes de scripting, motores de bases de datos, fuentes de datos web de eventos.</w:t>
+            </w:r>
+          </w:p>
+        </w:tc>
+        <w:tc>
+          <w:tcPr>
+            <w:tcW w:w="1101" w:type="dxa"/>
             <w:tcBorders>
               <w:right w:val="single" w:sz="4" w:space="0" w:color="FFFFFF"/>
             </w:tcBorders>
           </w:tcPr>
           <w:p>
             <w:pPr>
-              <w:jc w:val="both"/>
-              <w:rPr>
-                <w:i/>
-                <w:iCs/>
-                <w:color w:val="548DD4"/>
-                <w:sz w:val="18"/>
-                <w:szCs w:val="18"/>
-              </w:rPr>
-            </w:pPr>
+              <w:jc w:val="center"/>
+              <w:rPr>
+                <w:sz w:val="18"/>
+                <w:szCs w:val="18"/>
+              </w:rPr>
+            </w:pPr>
+            <w:r>
+              <w:rPr>
+                <w:sz w:val="18"/>
+                <w:szCs w:val="18"/>
+              </w:rPr>
+              <w:t>Semanas 5 a 13</w:t>
+            </w:r>
           </w:p>
         </w:tc>
         <w:tc>
@@ -4034,15 +4149,201 @@
           </w:tcPr>
           <w:p>
             <w:pPr>
+              <w:jc w:val="center"/>
+              <w:rPr>
+                <w:sz w:val="18"/>
+                <w:szCs w:val="18"/>
+              </w:rPr>
+            </w:pPr>
+            <w:r>
+              <w:rPr>
+                <w:sz w:val="18"/>
+                <w:szCs w:val="18"/>
+              </w:rPr>
+              <w:t>Benjamín Vargas (Desarrollador / Manejo de datos).</w:t>
+            </w:r>
+          </w:p>
+        </w:tc>
+        <w:tc>
+          <w:tcPr>
+            <w:tcW w:w="1581" w:type="dxa"/>
+          </w:tcPr>
+          <w:p>
+            <w:pPr>
               <w:jc w:val="both"/>
               <w:rPr>
-                <w:i/>
-                <w:iCs/>
-                <w:color w:val="548DD4"/>
-                <w:sz w:val="18"/>
-                <w:szCs w:val="18"/>
-              </w:rPr>
-            </w:pPr>
+                <w:sz w:val="18"/>
+                <w:szCs w:val="18"/>
+              </w:rPr>
+            </w:pPr>
+            <w:r>
+              <w:rPr>
+                <w:sz w:val="18"/>
+                <w:szCs w:val="18"/>
+              </w:rPr>
+              <w:t>Dificultad: Infraestructura limitada para almacenar grandes volúmenes de datos y variabilidad en el formato de los datos de eventos obtenidos de terceros.</w:t>
+            </w:r>
+          </w:p>
+        </w:tc>
+      </w:tr>
+      <w:tr>
+        <w:trPr>
+          <w:jc w:val="center"/>
+        </w:trPr>
+        <w:tc>
+          <w:tcPr>
+            <w:tcW w:w="1580" w:type="dxa"/>
+          </w:tcPr>
+          <w:p>
+            <w:pPr>
+              <w:jc w:val="center"/>
+              <w:rPr>
+                <w:sz w:val="18"/>
+                <w:szCs w:val="18"/>
+              </w:rPr>
+            </w:pPr>
+            <w:r>
+              <w:rPr>
+                <w:sz w:val="18"/>
+                <w:szCs w:val="18"/>
+              </w:rPr>
+              <w:t>Desarrollo de Aplicaciones</w:t>
+            </w:r>
+            <w:r>
+              <w:rPr>
+                <w:sz w:val="18"/>
+                <w:szCs w:val="18"/>
+              </w:rPr>
+              <w:t>.</w:t>
+            </w:r>
+          </w:p>
+        </w:tc>
+        <w:tc>
+          <w:tcPr>
+            <w:tcW w:w="1580" w:type="dxa"/>
+          </w:tcPr>
+          <w:p>
+            <w:pPr>
+              <w:jc w:val="center"/>
+              <w:rPr>
+                <w:sz w:val="18"/>
+                <w:szCs w:val="18"/>
+              </w:rPr>
+            </w:pPr>
+            <w:r>
+              <w:rPr>
+                <w:sz w:val="18"/>
+                <w:szCs w:val="18"/>
+              </w:rPr>
+              <w:t>Desarrollo e Integración de la App</w:t>
+            </w:r>
+          </w:p>
+        </w:tc>
+        <w:tc>
+          <w:tcPr>
+            <w:tcW w:w="1580" w:type="dxa"/>
+          </w:tcPr>
+          <w:p>
+            <w:pPr>
+              <w:jc w:val="both"/>
+              <w:rPr>
+                <w:sz w:val="18"/>
+                <w:szCs w:val="18"/>
+              </w:rPr>
+            </w:pPr>
+            <w:r>
+              <w:rPr>
+                <w:sz w:val="18"/>
+                <w:szCs w:val="18"/>
+              </w:rPr>
+              <w:t>Desarrollar la aplicación base (mapa y barra de búsqueda) e integrar los servicios para la correcta visualización de eventos.</w:t>
+            </w:r>
+          </w:p>
+        </w:tc>
+        <w:tc>
+          <w:tcPr>
+            <w:tcW w:w="2059" w:type="dxa"/>
+          </w:tcPr>
+          <w:p>
+            <w:pPr>
+              <w:jc w:val="both"/>
+              <w:rPr>
+                <w:sz w:val="18"/>
+                <w:szCs w:val="18"/>
+              </w:rPr>
+            </w:pPr>
+            <w:r>
+              <w:rPr>
+                <w:sz w:val="18"/>
+                <w:szCs w:val="18"/>
+              </w:rPr>
+              <w:t xml:space="preserve">Entornos de desarrollo móvil, </w:t>
+            </w:r>
+            <w:proofErr w:type="spellStart"/>
+            <w:r>
+              <w:rPr>
+                <w:sz w:val="18"/>
+                <w:szCs w:val="18"/>
+              </w:rPr>
+              <w:t>APIs</w:t>
+            </w:r>
+            <w:proofErr w:type="spellEnd"/>
+            <w:r>
+              <w:rPr>
+                <w:sz w:val="18"/>
+                <w:szCs w:val="18"/>
+              </w:rPr>
+              <w:t xml:space="preserve"> de mapas, computadores.</w:t>
+            </w:r>
+          </w:p>
+        </w:tc>
+        <w:tc>
+          <w:tcPr>
+            <w:tcW w:w="1101" w:type="dxa"/>
+            <w:tcBorders>
+              <w:right w:val="single" w:sz="4" w:space="0" w:color="FFFFFF"/>
+            </w:tcBorders>
+          </w:tcPr>
+          <w:p>
+            <w:pPr>
+              <w:jc w:val="center"/>
+              <w:rPr>
+                <w:sz w:val="18"/>
+                <w:szCs w:val="18"/>
+              </w:rPr>
+            </w:pPr>
+            <w:r>
+              <w:rPr>
+                <w:sz w:val="18"/>
+                <w:szCs w:val="18"/>
+              </w:rPr>
+              <w:t>Semanas 10 a 15</w:t>
+            </w:r>
+          </w:p>
+        </w:tc>
+        <w:tc>
+          <w:tcPr>
+            <w:tcW w:w="1580" w:type="dxa"/>
+            <w:tcBorders>
+              <w:left w:val="single" w:sz="4" w:space="0" w:color="FFFFFF"/>
+            </w:tcBorders>
+            <w:shd w:val="clear" w:color="auto" w:fill="D9D9D9"/>
+          </w:tcPr>
+          <w:p>
+            <w:pPr>
+              <w:jc w:val="center"/>
+              <w:rPr>
+                <w:sz w:val="18"/>
+                <w:szCs w:val="18"/>
+              </w:rPr>
+            </w:pPr>
+            <w:r>
+              <w:rPr>
+                <w:sz w:val="18"/>
+                <w:szCs w:val="18"/>
+              </w:rPr>
+              <w:t>Iñaki Fernández y Benjamín Vargas.</w:t>
+            </w:r>
           </w:p>
         </w:tc>
         <w:tc>
@@ -4053,13 +4354,193 @@
             <w:pPr>
               <w:jc w:val="both"/>
               <w:rPr>
-                <w:i/>
-                <w:iCs/>
-                <w:color w:val="548DD4"/>
-                <w:sz w:val="18"/>
-                <w:szCs w:val="18"/>
-              </w:rPr>
-            </w:pPr>
+                <w:sz w:val="18"/>
+                <w:szCs w:val="18"/>
+              </w:rPr>
+            </w:pPr>
+            <w:r>
+              <w:rPr>
+                <w:sz w:val="18"/>
+                <w:szCs w:val="18"/>
+              </w:rPr>
+              <w:t>Dificultad: Asegurar compatibilidad en iOS y Android con un presupuesto limitado, lo que restringe el uso de herramientas de pago o licencias.</w:t>
+            </w:r>
+          </w:p>
+        </w:tc>
+      </w:tr>
+      <w:tr>
+        <w:trPr>
+          <w:jc w:val="center"/>
+        </w:trPr>
+        <w:tc>
+          <w:tcPr>
+            <w:tcW w:w="1580" w:type="dxa"/>
+          </w:tcPr>
+          <w:p>
+            <w:pPr>
+              <w:jc w:val="center"/>
+              <w:rPr>
+                <w:sz w:val="18"/>
+                <w:szCs w:val="18"/>
+              </w:rPr>
+            </w:pPr>
+            <w:r>
+              <w:rPr>
+                <w:sz w:val="18"/>
+                <w:szCs w:val="18"/>
+              </w:rPr>
+              <w:t>Aseguramiento de Calidad de Software (QA).</w:t>
+            </w:r>
+          </w:p>
+        </w:tc>
+        <w:tc>
+          <w:tcPr>
+            <w:tcW w:w="1580" w:type="dxa"/>
+          </w:tcPr>
+          <w:p>
+            <w:pPr>
+              <w:jc w:val="center"/>
+              <w:rPr>
+                <w:sz w:val="18"/>
+                <w:szCs w:val="18"/>
+              </w:rPr>
+            </w:pPr>
+            <w:r>
+              <w:rPr>
+                <w:sz w:val="18"/>
+                <w:szCs w:val="18"/>
+              </w:rPr>
+              <w:t>Pruebas y Presentación Final</w:t>
+            </w:r>
+          </w:p>
+        </w:tc>
+        <w:tc>
+          <w:tcPr>
+            <w:tcW w:w="1580" w:type="dxa"/>
+          </w:tcPr>
+          <w:p>
+            <w:pPr>
+              <w:jc w:val="both"/>
+              <w:rPr>
+                <w:sz w:val="18"/>
+                <w:szCs w:val="18"/>
+              </w:rPr>
+            </w:pPr>
+            <w:r>
+              <w:rPr>
+                <w:sz w:val="18"/>
+                <w:szCs w:val="18"/>
+              </w:rPr>
+              <w:t xml:space="preserve">Desarrollar e implementar pruebas del sistema para asegurar cero errores, culminando con la </w:t>
+            </w:r>
+            <w:r>
+              <w:rPr>
+                <w:sz w:val="18"/>
+                <w:szCs w:val="18"/>
+              </w:rPr>
+              <w:lastRenderedPageBreak/>
+              <w:t>presentación del prototipo funcional.</w:t>
+            </w:r>
+          </w:p>
+        </w:tc>
+        <w:tc>
+          <w:tcPr>
+            <w:tcW w:w="2059" w:type="dxa"/>
+          </w:tcPr>
+          <w:p>
+            <w:pPr>
+              <w:jc w:val="both"/>
+              <w:rPr>
+                <w:sz w:val="18"/>
+                <w:szCs w:val="18"/>
+              </w:rPr>
+            </w:pPr>
+            <w:r>
+              <w:rPr>
+                <w:sz w:val="18"/>
+                <w:szCs w:val="18"/>
+              </w:rPr>
+              <w:lastRenderedPageBreak/>
+              <w:t>Dispositivos móviles de prueba (Android/iOS), protocolos de prueba.</w:t>
+            </w:r>
+          </w:p>
+        </w:tc>
+        <w:tc>
+          <w:tcPr>
+            <w:tcW w:w="1101" w:type="dxa"/>
+            <w:tcBorders>
+              <w:right w:val="single" w:sz="4" w:space="0" w:color="FFFFFF"/>
+            </w:tcBorders>
+          </w:tcPr>
+          <w:p>
+            <w:pPr>
+              <w:jc w:val="center"/>
+              <w:rPr>
+                <w:sz w:val="18"/>
+                <w:szCs w:val="18"/>
+              </w:rPr>
+            </w:pPr>
+            <w:r>
+              <w:rPr>
+                <w:sz w:val="18"/>
+                <w:szCs w:val="18"/>
+              </w:rPr>
+              <w:t>Semanas 15 a 18</w:t>
+            </w:r>
+          </w:p>
+        </w:tc>
+        <w:tc>
+          <w:tcPr>
+            <w:tcW w:w="1580" w:type="dxa"/>
+            <w:tcBorders>
+              <w:left w:val="single" w:sz="4" w:space="0" w:color="FFFFFF"/>
+            </w:tcBorders>
+            <w:shd w:val="clear" w:color="auto" w:fill="D9D9D9"/>
+          </w:tcPr>
+          <w:p>
+            <w:pPr>
+              <w:jc w:val="center"/>
+              <w:rPr>
+                <w:sz w:val="18"/>
+                <w:szCs w:val="18"/>
+              </w:rPr>
+            </w:pPr>
+            <w:r>
+              <w:rPr>
+                <w:sz w:val="18"/>
+                <w:szCs w:val="18"/>
+              </w:rPr>
+              <w:t>Equipo Completo</w:t>
+            </w:r>
+          </w:p>
+        </w:tc>
+        <w:tc>
+          <w:tcPr>
+            <w:tcW w:w="1581" w:type="dxa"/>
+          </w:tcPr>
+          <w:p>
+            <w:pPr>
+              <w:jc w:val="both"/>
+              <w:rPr>
+                <w:sz w:val="18"/>
+                <w:szCs w:val="18"/>
+              </w:rPr>
+            </w:pPr>
+            <w:r>
+              <w:rPr>
+                <w:sz w:val="18"/>
+                <w:szCs w:val="18"/>
+              </w:rPr>
+              <w:t xml:space="preserve">Dificultad: El proyecto debe terminarse estrictamente antes del 30-11-2026, por lo que el tiempo de </w:t>
+            </w:r>
+            <w:r>
+              <w:rPr>
+                <w:sz w:val="18"/>
+                <w:szCs w:val="18"/>
+              </w:rPr>
+              <w:lastRenderedPageBreak/>
+              <w:t>corrección de errores en esta fase será crítico.</w:t>
+            </w:r>
           </w:p>
         </w:tc>
       </w:tr>
@@ -4178,6 +4659,9 @@
         </w:rPr>
       </w:pPr>
       <w:r>
+        <w:rPr>
+          <w:noProof/>
+        </w:rPr>
         <w:drawing>
           <wp:anchor distT="0" distB="0" distL="114300" distR="114300" simplePos="0" relativeHeight="251659264" behindDoc="1" locked="0" layoutInCell="1" allowOverlap="1" wp14:anchorId="76564CDA" wp14:editId="402A9EC7">
             <wp:simplePos x="0" y="0"/>
@@ -5394,7 +5878,6 @@
   <w:style w:type="character" w:default="1" w:styleId="Fuentedeprrafopredeter">
     <w:name w:val="Default Paragraph Font"/>
     <w:uiPriority w:val="1"/>
-    <w:semiHidden/>
     <w:unhideWhenUsed/>
   </w:style>
   <w:style w:type="table" w:default="1" w:styleId="Tablanormal">

</xml_diff>